<commit_message>
feat: code location service
</commit_message>
<xml_diff>
--- a/NoteUber.docx
+++ b/NoteUber.docx
@@ -61,77 +61,6 @@
                             <w:pPr>
                               <w:jc w:val="center"/>
                             </w:pPr>
-                            <w:r>
-                              <w:rPr>
-                                <w:noProof/>
-                              </w:rPr>
-                              <mc:AlternateContent>
-                                <mc:Choice Requires="wps">
-                                  <w:drawing>
-                                    <wp:inline distT="0" distB="0" distL="0" distR="0">
-                                      <wp:extent cx="121920" cy="121920"/>
-                                      <wp:effectExtent l="0" t="0" r="0" b="0"/>
-                                      <wp:docPr id="9" name="Rectangle 9" descr="blob:https://www.facebook.com/44d9f909-5e5c-41e9-ab4a-5c6273ad076d"/>
-                                      <wp:cNvGraphicFramePr>
-                                        <a:graphicFrameLocks xmlns:a="http://schemas.openxmlformats.org/drawingml/2006/main" noChangeAspect="1"/>
-                                      </wp:cNvGraphicFramePr>
-                                      <a:graphic xmlns:a="http://schemas.openxmlformats.org/drawingml/2006/main">
-                                        <a:graphicData uri="http://schemas.microsoft.com/office/word/2010/wordprocessingShape">
-                                          <wps:wsp>
-                                            <wps:cNvSpPr>
-                                              <a:spLocks noChangeAspect="1" noChangeArrowheads="1"/>
-                                            </wps:cNvSpPr>
-                                            <wps:spPr bwMode="auto">
-                                              <a:xfrm>
-                                                <a:off x="0" y="0"/>
-                                                <a:ext cx="121920" cy="121920"/>
-                                              </a:xfrm>
-                                              <a:prstGeom prst="rect">
-                                                <a:avLst/>
-                                              </a:prstGeom>
-                                              <a:noFill/>
-                                              <a:ln>
-                                                <a:noFill/>
-                                              </a:ln>
-                                              <a:extLst>
-                                                <a:ext uri="{909E8E84-426E-40DD-AFC4-6F175D3DCCD1}">
-                                                  <a14:hiddenFill xmlns:a14="http://schemas.microsoft.com/office/drawing/2010/main">
-                                                    <a:solidFill>
-                                                      <a:srgbClr val="FFFFFF"/>
-                                                    </a:solidFill>
-                                                  </a14:hiddenFill>
-                                                </a:ext>
-                                                <a:ext uri="{91240B29-F687-4F45-9708-019B960494DF}">
-                                                  <a14:hiddenLine xmlns:a14="http://schemas.microsoft.com/office/drawing/2010/main" w="9525">
-                                                    <a:solidFill>
-                                                      <a:srgbClr val="000000"/>
-                                                    </a:solidFill>
-                                                    <a:miter lim="800000"/>
-                                                    <a:headEnd/>
-                                                    <a:tailEnd/>
-                                                  </a14:hiddenLine>
-                                                </a:ext>
-                                              </a:extLst>
-                                            </wps:spPr>
-                                            <wps:bodyPr rot="0" vert="horz" wrap="square" lIns="91440" tIns="45720" rIns="91440" bIns="45720" anchor="t" anchorCtr="0" upright="1">
-                                              <a:noAutofit/>
-                                            </wps:bodyPr>
-                                          </wps:wsp>
-                                        </a:graphicData>
-                                      </a:graphic>
-                                    </wp:inline>
-                                  </w:drawing>
-                                </mc:Choice>
-                                <mc:Fallback>
-                                  <w:pict>
-                                    <v:rect w14:anchorId="744C5F2F" id="Rectangle 9" o:spid="_x0000_s1026" alt="blob:https://www.facebook.com/44d9f909-5e5c-41e9-ab4a-5c6273ad076d" style="width:9.6pt;height:9.6pt;visibility:visible;mso-wrap-style:square;mso-left-percent:-10001;mso-top-percent:-10001;mso-position-horizontal:absolute;mso-position-horizontal-relative:char;mso-position-vertical:absolute;mso-position-vertical-relative:line;mso-left-percent:-10001;mso-top-percent:-10001;v-text-anchor:top" o:gfxdata="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" filled="f" stroked="f">
-                                      <o:lock v:ext="edit" aspectratio="t"/>
-                                      <w10:anchorlock/>
-                                    </v:rect>
-                                  </w:pict>
-                                </mc:Fallback>
-                              </mc:AlternateContent>
-                            </w:r>
                           </w:p>
                         </w:txbxContent>
                       </wps:txbx>
@@ -234,8 +163,10 @@
           </mc:Fallback>
         </mc:AlternateContent>
       </w:r>
-      <w:bookmarkStart w:id="0" w:name="_GoBack"/>
-      <w:r>
+      <w:r>
+        <w:rPr>
+          <w:noProof/>
+        </w:rPr>
         <w:drawing>
           <wp:inline distT="0" distB="0" distL="0" distR="0" wp14:anchorId="747E4CB1" wp14:editId="07CD0106">
             <wp:extent cx="5761990" cy="2896235"/>
@@ -272,7 +203,6 @@
           </wp:inline>
         </w:drawing>
       </w:r>
-      <w:bookmarkEnd w:id="0"/>
     </w:p>
     <w:p>
       <w:r>
@@ -831,12 +761,11 @@
         <w:rPr>
           <w:noProof/>
         </w:rPr>
-        <w:lastRenderedPageBreak/>
         <w:drawing>
-          <wp:inline distT="0" distB="0" distL="0" distR="0" wp14:anchorId="0948C79A" wp14:editId="0891C7F4">
-            <wp:extent cx="5761990" cy="4704715"/>
-            <wp:effectExtent l="0" t="0" r="0" b="635"/>
-            <wp:docPr id="6" name="Picture 6"/>
+          <wp:inline distT="0" distB="0" distL="0" distR="0" wp14:anchorId="674A8BDB" wp14:editId="1C4EF94B">
+            <wp:extent cx="3200677" cy="1143099"/>
+            <wp:effectExtent l="0" t="0" r="0" b="0"/>
+            <wp:docPr id="12" name="Picture 12"/>
             <wp:cNvGraphicFramePr>
               <a:graphicFrameLocks xmlns:a="http://schemas.openxmlformats.org/drawingml/2006/main" noChangeAspect="1"/>
             </wp:cNvGraphicFramePr>
@@ -856,6 +785,379 @@
                   <pic:spPr>
                     <a:xfrm>
                       <a:off x="0" y="0"/>
+                      <a:ext cx="3200677" cy="1143099"/>
+                    </a:xfrm>
+                    <a:prstGeom prst="rect">
+                      <a:avLst/>
+                    </a:prstGeom>
+                  </pic:spPr>
+                </pic:pic>
+              </a:graphicData>
+            </a:graphic>
+          </wp:inline>
+        </w:drawing>
+      </w:r>
+    </w:p>
+    <w:p>
+      <w:r>
+        <w:rPr>
+          <w:noProof/>
+        </w:rPr>
+        <w:drawing>
+          <wp:inline distT="0" distB="0" distL="0" distR="0" wp14:anchorId="14BB1B0C" wp14:editId="46185D0C">
+            <wp:extent cx="5761990" cy="2325370"/>
+            <wp:effectExtent l="0" t="0" r="0" b="0"/>
+            <wp:docPr id="13" name="Picture 13"/>
+            <wp:cNvGraphicFramePr>
+              <a:graphicFrameLocks xmlns:a="http://schemas.openxmlformats.org/drawingml/2006/main" noChangeAspect="1"/>
+            </wp:cNvGraphicFramePr>
+            <a:graphic xmlns:a="http://schemas.openxmlformats.org/drawingml/2006/main">
+              <a:graphicData uri="http://schemas.openxmlformats.org/drawingml/2006/picture">
+                <pic:pic xmlns:pic="http://schemas.openxmlformats.org/drawingml/2006/picture">
+                  <pic:nvPicPr>
+                    <pic:cNvPr id="1" name=""/>
+                    <pic:cNvPicPr/>
+                  </pic:nvPicPr>
+                  <pic:blipFill>
+                    <a:blip r:embed="rId11"/>
+                    <a:stretch>
+                      <a:fillRect/>
+                    </a:stretch>
+                  </pic:blipFill>
+                  <pic:spPr>
+                    <a:xfrm>
+                      <a:off x="0" y="0"/>
+                      <a:ext cx="5761990" cy="2325370"/>
+                    </a:xfrm>
+                    <a:prstGeom prst="rect">
+                      <a:avLst/>
+                    </a:prstGeom>
+                  </pic:spPr>
+                </pic:pic>
+              </a:graphicData>
+            </a:graphic>
+          </wp:inline>
+        </w:drawing>
+      </w:r>
+    </w:p>
+    <w:p>
+      <w:r>
+        <w:rPr>
+          <w:noProof/>
+        </w:rPr>
+        <w:lastRenderedPageBreak/>
+        <w:drawing>
+          <wp:inline distT="0" distB="0" distL="0" distR="0" wp14:anchorId="5E34DBE3" wp14:editId="22F233DA">
+            <wp:extent cx="5761990" cy="5585460"/>
+            <wp:effectExtent l="0" t="0" r="0" b="0"/>
+            <wp:docPr id="14" name="Picture 14"/>
+            <wp:cNvGraphicFramePr>
+              <a:graphicFrameLocks xmlns:a="http://schemas.openxmlformats.org/drawingml/2006/main" noChangeAspect="1"/>
+            </wp:cNvGraphicFramePr>
+            <a:graphic xmlns:a="http://schemas.openxmlformats.org/drawingml/2006/main">
+              <a:graphicData uri="http://schemas.openxmlformats.org/drawingml/2006/picture">
+                <pic:pic xmlns:pic="http://schemas.openxmlformats.org/drawingml/2006/picture">
+                  <pic:nvPicPr>
+                    <pic:cNvPr id="1" name=""/>
+                    <pic:cNvPicPr/>
+                  </pic:nvPicPr>
+                  <pic:blipFill>
+                    <a:blip r:embed="rId12"/>
+                    <a:stretch>
+                      <a:fillRect/>
+                    </a:stretch>
+                  </pic:blipFill>
+                  <pic:spPr>
+                    <a:xfrm>
+                      <a:off x="0" y="0"/>
+                      <a:ext cx="5761990" cy="5585460"/>
+                    </a:xfrm>
+                    <a:prstGeom prst="rect">
+                      <a:avLst/>
+                    </a:prstGeom>
+                  </pic:spPr>
+                </pic:pic>
+              </a:graphicData>
+            </a:graphic>
+          </wp:inline>
+        </w:drawing>
+      </w:r>
+    </w:p>
+    <w:p>
+      <w:proofErr w:type="spellStart"/>
+      <w:r>
+        <w:t>Hiểu</w:t>
+      </w:r>
+      <w:proofErr w:type="spellEnd"/>
+      <w:r>
+        <w:t xml:space="preserve"> </w:t>
+      </w:r>
+      <w:proofErr w:type="spellStart"/>
+      <w:r>
+        <w:t>đơn</w:t>
+      </w:r>
+      <w:proofErr w:type="spellEnd"/>
+      <w:r>
+        <w:t xml:space="preserve"> </w:t>
+      </w:r>
+      <w:proofErr w:type="spellStart"/>
+      <w:r>
+        <w:t>giản</w:t>
+      </w:r>
+      <w:proofErr w:type="spellEnd"/>
+      <w:r>
+        <w:t xml:space="preserve"> </w:t>
+      </w:r>
+      <w:proofErr w:type="spellStart"/>
+      <w:r>
+        <w:t>nó</w:t>
+      </w:r>
+      <w:proofErr w:type="spellEnd"/>
+      <w:r>
+        <w:t xml:space="preserve"> </w:t>
+      </w:r>
+      <w:proofErr w:type="spellStart"/>
+      <w:r>
+        <w:t>tạo</w:t>
+      </w:r>
+      <w:proofErr w:type="spellEnd"/>
+      <w:r>
+        <w:t xml:space="preserve"> DI </w:t>
+      </w:r>
+      <w:proofErr w:type="spellStart"/>
+      <w:r>
+        <w:t>cho</w:t>
+      </w:r>
+      <w:proofErr w:type="spellEnd"/>
+      <w:r>
+        <w:t xml:space="preserve"> method </w:t>
+      </w:r>
+      <w:proofErr w:type="spellStart"/>
+      <w:r>
+        <w:t>còn</w:t>
+      </w:r>
+      <w:proofErr w:type="spellEnd"/>
+      <w:r>
+        <w:t xml:space="preserve"> Component </w:t>
+      </w:r>
+      <w:proofErr w:type="spellStart"/>
+      <w:r>
+        <w:t>cho</w:t>
+      </w:r>
+      <w:proofErr w:type="spellEnd"/>
+      <w:r>
+        <w:t xml:space="preserve"> 1 class</w:t>
+      </w:r>
+    </w:p>
+    <w:p>
+      <w:r>
+        <w:lastRenderedPageBreak/>
+        <w:drawing>
+          <wp:inline distT="0" distB="0" distL="0" distR="0" wp14:anchorId="10A023D3" wp14:editId="75CECCA0">
+            <wp:extent cx="3406435" cy="5662151"/>
+            <wp:effectExtent l="0" t="0" r="3810" b="0"/>
+            <wp:docPr id="15" name="Picture 15"/>
+            <wp:cNvGraphicFramePr>
+              <a:graphicFrameLocks xmlns:a="http://schemas.openxmlformats.org/drawingml/2006/main" noChangeAspect="1"/>
+            </wp:cNvGraphicFramePr>
+            <a:graphic xmlns:a="http://schemas.openxmlformats.org/drawingml/2006/main">
+              <a:graphicData uri="http://schemas.openxmlformats.org/drawingml/2006/picture">
+                <pic:pic xmlns:pic="http://schemas.openxmlformats.org/drawingml/2006/picture">
+                  <pic:nvPicPr>
+                    <pic:cNvPr id="1" name=""/>
+                    <pic:cNvPicPr/>
+                  </pic:nvPicPr>
+                  <pic:blipFill>
+                    <a:blip r:embed="rId13"/>
+                    <a:stretch>
+                      <a:fillRect/>
+                    </a:stretch>
+                  </pic:blipFill>
+                  <pic:spPr>
+                    <a:xfrm>
+                      <a:off x="0" y="0"/>
+                      <a:ext cx="3406435" cy="5662151"/>
+                    </a:xfrm>
+                    <a:prstGeom prst="rect">
+                      <a:avLst/>
+                    </a:prstGeom>
+                  </pic:spPr>
+                </pic:pic>
+              </a:graphicData>
+            </a:graphic>
+          </wp:inline>
+        </w:drawing>
+      </w:r>
+    </w:p>
+    <w:p>
+      <w:r>
+        <w:lastRenderedPageBreak/>
+        <w:drawing>
+          <wp:inline distT="0" distB="0" distL="0" distR="0" wp14:anchorId="7BCFB83F" wp14:editId="1F9F2C85">
+            <wp:extent cx="3391194" cy="5395428"/>
+            <wp:effectExtent l="0" t="0" r="0" b="0"/>
+            <wp:docPr id="16" name="Picture 16"/>
+            <wp:cNvGraphicFramePr>
+              <a:graphicFrameLocks xmlns:a="http://schemas.openxmlformats.org/drawingml/2006/main" noChangeAspect="1"/>
+            </wp:cNvGraphicFramePr>
+            <a:graphic xmlns:a="http://schemas.openxmlformats.org/drawingml/2006/main">
+              <a:graphicData uri="http://schemas.openxmlformats.org/drawingml/2006/picture">
+                <pic:pic xmlns:pic="http://schemas.openxmlformats.org/drawingml/2006/picture">
+                  <pic:nvPicPr>
+                    <pic:cNvPr id="1" name=""/>
+                    <pic:cNvPicPr/>
+                  </pic:nvPicPr>
+                  <pic:blipFill>
+                    <a:blip r:embed="rId14"/>
+                    <a:stretch>
+                      <a:fillRect/>
+                    </a:stretch>
+                  </pic:blipFill>
+                  <pic:spPr>
+                    <a:xfrm>
+                      <a:off x="0" y="0"/>
+                      <a:ext cx="3391194" cy="5395428"/>
+                    </a:xfrm>
+                    <a:prstGeom prst="rect">
+                      <a:avLst/>
+                    </a:prstGeom>
+                  </pic:spPr>
+                </pic:pic>
+              </a:graphicData>
+            </a:graphic>
+          </wp:inline>
+        </w:drawing>
+      </w:r>
+    </w:p>
+    <w:p>
+      <w:proofErr w:type="spellStart"/>
+      <w:r>
+        <w:lastRenderedPageBreak/>
+        <w:t>Config</w:t>
+      </w:r>
+      <w:proofErr w:type="spellEnd"/>
+      <w:r>
+        <w:t xml:space="preserve"> </w:t>
+      </w:r>
+      <w:proofErr w:type="spellStart"/>
+      <w:r>
+        <w:t>redis</w:t>
+      </w:r>
+      <w:proofErr w:type="spellEnd"/>
+      <w:r>
+        <w:br/>
+      </w:r>
+      <w:r>
+        <w:drawing>
+          <wp:inline distT="0" distB="0" distL="0" distR="0" wp14:anchorId="76CA179A" wp14:editId="2022975E">
+            <wp:extent cx="5761990" cy="3583305"/>
+            <wp:effectExtent l="0" t="0" r="0" b="0"/>
+            <wp:docPr id="17" name="Picture 17"/>
+            <wp:cNvGraphicFramePr>
+              <a:graphicFrameLocks xmlns:a="http://schemas.openxmlformats.org/drawingml/2006/main" noChangeAspect="1"/>
+            </wp:cNvGraphicFramePr>
+            <a:graphic xmlns:a="http://schemas.openxmlformats.org/drawingml/2006/main">
+              <a:graphicData uri="http://schemas.openxmlformats.org/drawingml/2006/picture">
+                <pic:pic xmlns:pic="http://schemas.openxmlformats.org/drawingml/2006/picture">
+                  <pic:nvPicPr>
+                    <pic:cNvPr id="1" name=""/>
+                    <pic:cNvPicPr/>
+                  </pic:nvPicPr>
+                  <pic:blipFill>
+                    <a:blip r:embed="rId15"/>
+                    <a:stretch>
+                      <a:fillRect/>
+                    </a:stretch>
+                  </pic:blipFill>
+                  <pic:spPr>
+                    <a:xfrm>
+                      <a:off x="0" y="0"/>
+                      <a:ext cx="5761990" cy="3583305"/>
+                    </a:xfrm>
+                    <a:prstGeom prst="rect">
+                      <a:avLst/>
+                    </a:prstGeom>
+                  </pic:spPr>
+                </pic:pic>
+              </a:graphicData>
+            </a:graphic>
+          </wp:inline>
+        </w:drawing>
+      </w:r>
+    </w:p>
+    <w:p>
+      <w:r>
+        <w:rPr>
+          <w:noProof/>
+        </w:rPr>
+        <w:lastRenderedPageBreak/>
+        <w:drawing>
+          <wp:inline distT="0" distB="0" distL="0" distR="0" wp14:anchorId="39B97763" wp14:editId="78A2B8DB">
+            <wp:extent cx="3330229" cy="6187976"/>
+            <wp:effectExtent l="0" t="0" r="3810" b="3810"/>
+            <wp:docPr id="11" name="Picture 11"/>
+            <wp:cNvGraphicFramePr>
+              <a:graphicFrameLocks xmlns:a="http://schemas.openxmlformats.org/drawingml/2006/main" noChangeAspect="1"/>
+            </wp:cNvGraphicFramePr>
+            <a:graphic xmlns:a="http://schemas.openxmlformats.org/drawingml/2006/main">
+              <a:graphicData uri="http://schemas.openxmlformats.org/drawingml/2006/picture">
+                <pic:pic xmlns:pic="http://schemas.openxmlformats.org/drawingml/2006/picture">
+                  <pic:nvPicPr>
+                    <pic:cNvPr id="1" name=""/>
+                    <pic:cNvPicPr/>
+                  </pic:nvPicPr>
+                  <pic:blipFill>
+                    <a:blip r:embed="rId16"/>
+                    <a:stretch>
+                      <a:fillRect/>
+                    </a:stretch>
+                  </pic:blipFill>
+                  <pic:spPr>
+                    <a:xfrm>
+                      <a:off x="0" y="0"/>
+                      <a:ext cx="3330229" cy="6187976"/>
+                    </a:xfrm>
+                    <a:prstGeom prst="rect">
+                      <a:avLst/>
+                    </a:prstGeom>
+                  </pic:spPr>
+                </pic:pic>
+              </a:graphicData>
+            </a:graphic>
+          </wp:inline>
+        </w:drawing>
+      </w:r>
+    </w:p>
+    <w:p>
+      <w:r>
+        <w:rPr>
+          <w:noProof/>
+        </w:rPr>
+        <w:lastRenderedPageBreak/>
+        <w:drawing>
+          <wp:inline distT="0" distB="0" distL="0" distR="0" wp14:anchorId="0948C79A" wp14:editId="0891C7F4">
+            <wp:extent cx="5761990" cy="4704715"/>
+            <wp:effectExtent l="0" t="0" r="0" b="635"/>
+            <wp:docPr id="6" name="Picture 6"/>
+            <wp:cNvGraphicFramePr>
+              <a:graphicFrameLocks xmlns:a="http://schemas.openxmlformats.org/drawingml/2006/main" noChangeAspect="1"/>
+            </wp:cNvGraphicFramePr>
+            <a:graphic xmlns:a="http://schemas.openxmlformats.org/drawingml/2006/main">
+              <a:graphicData uri="http://schemas.openxmlformats.org/drawingml/2006/picture">
+                <pic:pic xmlns:pic="http://schemas.openxmlformats.org/drawingml/2006/picture">
+                  <pic:nvPicPr>
+                    <pic:cNvPr id="1" name=""/>
+                    <pic:cNvPicPr/>
+                  </pic:nvPicPr>
+                  <pic:blipFill>
+                    <a:blip r:embed="rId17"/>
+                    <a:stretch>
+                      <a:fillRect/>
+                    </a:stretch>
+                  </pic:blipFill>
+                  <pic:spPr>
+                    <a:xfrm>
+                      <a:off x="0" y="0"/>
                       <a:ext cx="5761990" cy="4704715"/>
                     </a:xfrm>
                     <a:prstGeom prst="rect">
@@ -890,7 +1192,7 @@
                     <pic:cNvPicPr/>
                   </pic:nvPicPr>
                   <pic:blipFill>
-                    <a:blip r:embed="rId11"/>
+                    <a:blip r:embed="rId18"/>
                     <a:stretch>
                       <a:fillRect/>
                     </a:stretch>
@@ -910,6 +1212,1416 @@
           </wp:inline>
         </w:drawing>
       </w:r>
+    </w:p>
+    <w:p>
+      <w:proofErr w:type="spellStart"/>
+      <w:r>
+        <w:lastRenderedPageBreak/>
+        <w:t>Với</w:t>
+      </w:r>
+      <w:proofErr w:type="spellEnd"/>
+      <w:r>
+        <w:t xml:space="preserve"> service location-service </w:t>
+      </w:r>
+      <w:proofErr w:type="spellStart"/>
+      <w:r>
+        <w:t>thì</w:t>
+      </w:r>
+      <w:proofErr w:type="spellEnd"/>
+      <w:r>
+        <w:t xml:space="preserve"> </w:t>
+      </w:r>
+      <w:proofErr w:type="spellStart"/>
+      <w:r>
+        <w:t>việc</w:t>
+      </w:r>
+      <w:proofErr w:type="spellEnd"/>
+      <w:r>
+        <w:t xml:space="preserve"> </w:t>
+      </w:r>
+      <w:proofErr w:type="spellStart"/>
+      <w:r>
+        <w:t>quan</w:t>
+      </w:r>
+      <w:proofErr w:type="spellEnd"/>
+      <w:r>
+        <w:t xml:space="preserve"> </w:t>
+      </w:r>
+      <w:proofErr w:type="spellStart"/>
+      <w:r>
+        <w:t>trọng</w:t>
+      </w:r>
+      <w:proofErr w:type="spellEnd"/>
+      <w:r>
+        <w:t xml:space="preserve"> </w:t>
+      </w:r>
+      <w:proofErr w:type="spellStart"/>
+      <w:r>
+        <w:t>sẽ</w:t>
+      </w:r>
+      <w:proofErr w:type="spellEnd"/>
+      <w:r>
+        <w:t xml:space="preserve"> </w:t>
+      </w:r>
+      <w:proofErr w:type="spellStart"/>
+      <w:r>
+        <w:t>là</w:t>
+      </w:r>
+      <w:proofErr w:type="spellEnd"/>
+      <w:r>
+        <w:t xml:space="preserve"> </w:t>
+      </w:r>
+      <w:proofErr w:type="spellStart"/>
+      <w:r>
+        <w:t>config</w:t>
+      </w:r>
+      <w:proofErr w:type="spellEnd"/>
+      <w:r>
+        <w:t xml:space="preserve"> </w:t>
+      </w:r>
+      <w:proofErr w:type="spellStart"/>
+      <w:r>
+        <w:t>redis</w:t>
+      </w:r>
+      <w:proofErr w:type="spellEnd"/>
+      <w:r>
+        <w:t xml:space="preserve">. </w:t>
+      </w:r>
+      <w:proofErr w:type="spellStart"/>
+      <w:r>
+        <w:t>Vì</w:t>
+      </w:r>
+      <w:proofErr w:type="spellEnd"/>
+      <w:r>
+        <w:t xml:space="preserve"> </w:t>
+      </w:r>
+      <w:proofErr w:type="spellStart"/>
+      <w:r>
+        <w:t>vai</w:t>
+      </w:r>
+      <w:proofErr w:type="spellEnd"/>
+      <w:r>
+        <w:t xml:space="preserve"> </w:t>
+      </w:r>
+      <w:proofErr w:type="spellStart"/>
+      <w:r>
+        <w:t>trò</w:t>
+      </w:r>
+      <w:proofErr w:type="spellEnd"/>
+      <w:r>
+        <w:t xml:space="preserve"> </w:t>
+      </w:r>
+      <w:proofErr w:type="spellStart"/>
+      <w:r>
+        <w:t>chính</w:t>
+      </w:r>
+      <w:proofErr w:type="spellEnd"/>
+      <w:r>
+        <w:t xml:space="preserve"> </w:t>
+      </w:r>
+      <w:proofErr w:type="spellStart"/>
+      <w:r>
+        <w:t>của</w:t>
+      </w:r>
+      <w:proofErr w:type="spellEnd"/>
+      <w:r>
+        <w:t xml:space="preserve"> l-s </w:t>
+      </w:r>
+      <w:proofErr w:type="spellStart"/>
+      <w:r>
+        <w:t>là</w:t>
+      </w:r>
+      <w:proofErr w:type="spellEnd"/>
+      <w:r>
+        <w:t xml:space="preserve"> </w:t>
+      </w:r>
+      <w:proofErr w:type="spellStart"/>
+      <w:r>
+        <w:t>lưu</w:t>
+      </w:r>
+      <w:proofErr w:type="spellEnd"/>
+      <w:r>
+        <w:t xml:space="preserve"> </w:t>
+      </w:r>
+      <w:proofErr w:type="spellStart"/>
+      <w:r>
+        <w:t>lại</w:t>
+      </w:r>
+      <w:proofErr w:type="spellEnd"/>
+      <w:r>
+        <w:t xml:space="preserve"> </w:t>
+      </w:r>
+      <w:proofErr w:type="spellStart"/>
+      <w:r>
+        <w:t>tọa</w:t>
+      </w:r>
+      <w:proofErr w:type="spellEnd"/>
+      <w:r>
+        <w:t xml:space="preserve"> </w:t>
+      </w:r>
+      <w:proofErr w:type="spellStart"/>
+      <w:r>
+        <w:t>độ</w:t>
+      </w:r>
+      <w:proofErr w:type="spellEnd"/>
+      <w:r>
+        <w:t xml:space="preserve"> </w:t>
+      </w:r>
+      <w:proofErr w:type="spellStart"/>
+      <w:r>
+        <w:t>xe</w:t>
+      </w:r>
+      <w:proofErr w:type="spellEnd"/>
+      <w:r>
+        <w:t xml:space="preserve"> </w:t>
+      </w:r>
+      <w:proofErr w:type="spellStart"/>
+      <w:r>
+        <w:t>của</w:t>
+      </w:r>
+      <w:proofErr w:type="spellEnd"/>
+      <w:r>
+        <w:t xml:space="preserve"> driver </w:t>
+      </w:r>
+      <w:proofErr w:type="spellStart"/>
+      <w:r>
+        <w:t>nên</w:t>
+      </w:r>
+      <w:proofErr w:type="spellEnd"/>
+      <w:r>
+        <w:t xml:space="preserve"> service </w:t>
+      </w:r>
+      <w:proofErr w:type="spellStart"/>
+      <w:r>
+        <w:t>sẽ</w:t>
+      </w:r>
+      <w:proofErr w:type="spellEnd"/>
+      <w:r>
+        <w:t xml:space="preserve"> </w:t>
+      </w:r>
+      <w:proofErr w:type="spellStart"/>
+      <w:r>
+        <w:t>được</w:t>
+      </w:r>
+      <w:proofErr w:type="spellEnd"/>
+      <w:r>
+        <w:t xml:space="preserve"> </w:t>
+      </w:r>
+      <w:proofErr w:type="spellStart"/>
+      <w:r>
+        <w:t>thiết</w:t>
+      </w:r>
+      <w:proofErr w:type="spellEnd"/>
+      <w:r>
+        <w:t xml:space="preserve"> </w:t>
+      </w:r>
+      <w:proofErr w:type="spellStart"/>
+      <w:r>
+        <w:t>lập</w:t>
+      </w:r>
+      <w:proofErr w:type="spellEnd"/>
+      <w:r>
+        <w:t xml:space="preserve"> </w:t>
+      </w:r>
+      <w:proofErr w:type="spellStart"/>
+      <w:r>
+        <w:t>sau</w:t>
+      </w:r>
+      <w:proofErr w:type="spellEnd"/>
+      <w:r>
+        <w:t xml:space="preserve"> </w:t>
+      </w:r>
+      <w:proofErr w:type="spellStart"/>
+      <w:r>
+        <w:t>mỗi</w:t>
+      </w:r>
+      <w:proofErr w:type="spellEnd"/>
+      <w:r>
+        <w:t xml:space="preserve"> 3s </w:t>
+      </w:r>
+      <w:proofErr w:type="spellStart"/>
+      <w:r>
+        <w:t>sẽ</w:t>
+      </w:r>
+      <w:proofErr w:type="spellEnd"/>
+      <w:r>
+        <w:t xml:space="preserve"> </w:t>
+      </w:r>
+      <w:proofErr w:type="spellStart"/>
+      <w:r>
+        <w:t>gửi</w:t>
+      </w:r>
+      <w:proofErr w:type="spellEnd"/>
+      <w:r>
+        <w:t xml:space="preserve"> 1 </w:t>
+      </w:r>
+      <w:proofErr w:type="spellStart"/>
+      <w:r>
+        <w:t>req</w:t>
+      </w:r>
+      <w:proofErr w:type="spellEnd"/>
+      <w:r>
+        <w:t xml:space="preserve"> updated </w:t>
+      </w:r>
+      <w:proofErr w:type="spellStart"/>
+      <w:r>
+        <w:t>vị</w:t>
+      </w:r>
+      <w:proofErr w:type="spellEnd"/>
+      <w:r>
+        <w:t xml:space="preserve"> </w:t>
+      </w:r>
+      <w:proofErr w:type="spellStart"/>
+      <w:r>
+        <w:t>trí</w:t>
+      </w:r>
+      <w:proofErr w:type="spellEnd"/>
+      <w:r>
+        <w:t xml:space="preserve"> </w:t>
+      </w:r>
+      <w:proofErr w:type="spellStart"/>
+      <w:r>
+        <w:t>của</w:t>
+      </w:r>
+      <w:proofErr w:type="spellEnd"/>
+      <w:r>
+        <w:t xml:space="preserve"> </w:t>
+      </w:r>
+      <w:proofErr w:type="spellStart"/>
+      <w:r>
+        <w:t>tài</w:t>
+      </w:r>
+      <w:proofErr w:type="spellEnd"/>
+      <w:r>
+        <w:t xml:space="preserve"> </w:t>
+      </w:r>
+      <w:proofErr w:type="spellStart"/>
+      <w:r>
+        <w:t>xế</w:t>
+      </w:r>
+      <w:proofErr w:type="spellEnd"/>
+      <w:r>
+        <w:t xml:space="preserve">. </w:t>
+      </w:r>
+      <w:proofErr w:type="spellStart"/>
+      <w:r>
+        <w:t>Việc</w:t>
+      </w:r>
+      <w:proofErr w:type="spellEnd"/>
+      <w:r>
+        <w:t xml:space="preserve"> </w:t>
+      </w:r>
+      <w:proofErr w:type="spellStart"/>
+      <w:r>
+        <w:t>config</w:t>
+      </w:r>
+      <w:proofErr w:type="spellEnd"/>
+      <w:r>
+        <w:t xml:space="preserve"> </w:t>
+      </w:r>
+      <w:proofErr w:type="spellStart"/>
+      <w:r>
+        <w:t>redis</w:t>
+      </w:r>
+      <w:proofErr w:type="spellEnd"/>
+      <w:r>
+        <w:t xml:space="preserve"> </w:t>
+      </w:r>
+      <w:proofErr w:type="spellStart"/>
+      <w:r>
+        <w:t>bản</w:t>
+      </w:r>
+      <w:proofErr w:type="spellEnd"/>
+      <w:r>
+        <w:t xml:space="preserve"> </w:t>
+      </w:r>
+      <w:proofErr w:type="spellStart"/>
+      <w:r>
+        <w:t>chất</w:t>
+      </w:r>
+      <w:proofErr w:type="spellEnd"/>
+      <w:r>
+        <w:t xml:space="preserve"> </w:t>
+      </w:r>
+      <w:proofErr w:type="spellStart"/>
+      <w:r>
+        <w:t>sẽ</w:t>
+      </w:r>
+      <w:proofErr w:type="spellEnd"/>
+      <w:r>
+        <w:t xml:space="preserve"> </w:t>
+      </w:r>
+      <w:proofErr w:type="spellStart"/>
+      <w:r>
+        <w:t>lưu</w:t>
+      </w:r>
+      <w:proofErr w:type="spellEnd"/>
+      <w:r>
+        <w:t xml:space="preserve"> </w:t>
+      </w:r>
+      <w:proofErr w:type="spellStart"/>
+      <w:r>
+        <w:t>lại</w:t>
+      </w:r>
+      <w:proofErr w:type="spellEnd"/>
+      <w:r>
+        <w:t xml:space="preserve"> location </w:t>
+      </w:r>
+      <w:proofErr w:type="spellStart"/>
+      <w:r>
+        <w:t>của</w:t>
+      </w:r>
+      <w:proofErr w:type="spellEnd"/>
+      <w:r>
+        <w:t xml:space="preserve"> driver </w:t>
+      </w:r>
+      <w:proofErr w:type="spellStart"/>
+      <w:r>
+        <w:t>và</w:t>
+      </w:r>
+      <w:proofErr w:type="spellEnd"/>
+      <w:r>
+        <w:t xml:space="preserve"> updated </w:t>
+      </w:r>
+      <w:proofErr w:type="spellStart"/>
+      <w:r>
+        <w:t>chúng</w:t>
+      </w:r>
+      <w:proofErr w:type="spellEnd"/>
+      <w:r>
+        <w:t xml:space="preserve">, </w:t>
+      </w:r>
+      <w:proofErr w:type="spellStart"/>
+      <w:r>
+        <w:t>chọn</w:t>
+      </w:r>
+      <w:proofErr w:type="spellEnd"/>
+      <w:r>
+        <w:t xml:space="preserve"> </w:t>
+      </w:r>
+      <w:proofErr w:type="spellStart"/>
+      <w:r>
+        <w:t>redis</w:t>
+      </w:r>
+      <w:proofErr w:type="spellEnd"/>
+      <w:r>
+        <w:t xml:space="preserve"> </w:t>
+      </w:r>
+      <w:proofErr w:type="spellStart"/>
+      <w:r>
+        <w:t>sẽ</w:t>
+      </w:r>
+      <w:proofErr w:type="spellEnd"/>
+      <w:r>
+        <w:t xml:space="preserve"> </w:t>
+      </w:r>
+      <w:proofErr w:type="spellStart"/>
+      <w:r>
+        <w:t>giúp</w:t>
+      </w:r>
+      <w:proofErr w:type="spellEnd"/>
+      <w:r>
+        <w:t xml:space="preserve"> </w:t>
+      </w:r>
+      <w:proofErr w:type="spellStart"/>
+      <w:r>
+        <w:t>việc</w:t>
+      </w:r>
+      <w:proofErr w:type="spellEnd"/>
+      <w:r>
+        <w:t xml:space="preserve"> </w:t>
+      </w:r>
+      <w:proofErr w:type="spellStart"/>
+      <w:r>
+        <w:t>lưu</w:t>
+      </w:r>
+      <w:proofErr w:type="spellEnd"/>
+      <w:r>
+        <w:t xml:space="preserve"> </w:t>
+      </w:r>
+      <w:proofErr w:type="spellStart"/>
+      <w:r>
+        <w:t>trữ</w:t>
+      </w:r>
+      <w:proofErr w:type="spellEnd"/>
+      <w:r>
+        <w:t xml:space="preserve"> </w:t>
+      </w:r>
+      <w:proofErr w:type="spellStart"/>
+      <w:r>
+        <w:t>dễ</w:t>
+      </w:r>
+      <w:proofErr w:type="spellEnd"/>
+      <w:r>
+        <w:t xml:space="preserve"> </w:t>
+      </w:r>
+      <w:proofErr w:type="spellStart"/>
+      <w:r>
+        <w:t>dàng</w:t>
+      </w:r>
+      <w:proofErr w:type="spellEnd"/>
+      <w:r>
+        <w:t xml:space="preserve"> </w:t>
+      </w:r>
+      <w:proofErr w:type="spellStart"/>
+      <w:r>
+        <w:t>hơn</w:t>
+      </w:r>
+      <w:proofErr w:type="spellEnd"/>
+      <w:r>
+        <w:t xml:space="preserve">, </w:t>
+      </w:r>
+      <w:proofErr w:type="spellStart"/>
+      <w:r>
+        <w:t>dễ</w:t>
+      </w:r>
+      <w:proofErr w:type="spellEnd"/>
+      <w:r>
+        <w:t xml:space="preserve"> </w:t>
+      </w:r>
+      <w:proofErr w:type="spellStart"/>
+      <w:r>
+        <w:t>dàng</w:t>
+      </w:r>
+      <w:proofErr w:type="spellEnd"/>
+      <w:r>
+        <w:t xml:space="preserve"> </w:t>
+      </w:r>
+      <w:proofErr w:type="spellStart"/>
+      <w:r>
+        <w:t>truy</w:t>
+      </w:r>
+      <w:proofErr w:type="spellEnd"/>
+      <w:r>
+        <w:t xml:space="preserve"> </w:t>
+      </w:r>
+      <w:proofErr w:type="spellStart"/>
+      <w:r>
+        <w:t>xuất</w:t>
+      </w:r>
+      <w:proofErr w:type="spellEnd"/>
+      <w:r>
+        <w:t xml:space="preserve">, </w:t>
+      </w:r>
+      <w:proofErr w:type="spellStart"/>
+      <w:r>
+        <w:t>dễ</w:t>
+      </w:r>
+      <w:proofErr w:type="spellEnd"/>
+      <w:r>
+        <w:t xml:space="preserve"> </w:t>
+      </w:r>
+      <w:proofErr w:type="spellStart"/>
+      <w:r>
+        <w:t>dàng</w:t>
+      </w:r>
+      <w:proofErr w:type="spellEnd"/>
+      <w:r>
+        <w:t xml:space="preserve"> </w:t>
+      </w:r>
+      <w:proofErr w:type="spellStart"/>
+      <w:r>
+        <w:t>thêm</w:t>
+      </w:r>
+      <w:proofErr w:type="spellEnd"/>
+      <w:r>
+        <w:t xml:space="preserve">, updated =&gt; </w:t>
+      </w:r>
+      <w:proofErr w:type="spellStart"/>
+      <w:r>
+        <w:t>thông</w:t>
+      </w:r>
+      <w:proofErr w:type="spellEnd"/>
+      <w:r>
+        <w:t xml:space="preserve"> qua </w:t>
+      </w:r>
+      <w:proofErr w:type="spellStart"/>
+      <w:r>
+        <w:t>thuật</w:t>
+      </w:r>
+      <w:proofErr w:type="spellEnd"/>
+      <w:r>
+        <w:t xml:space="preserve"> </w:t>
+      </w:r>
+      <w:proofErr w:type="spellStart"/>
+      <w:r>
+        <w:t>toán</w:t>
+      </w:r>
+      <w:proofErr w:type="spellEnd"/>
+      <w:r>
+        <w:t xml:space="preserve"> GEO </w:t>
+      </w:r>
+      <w:proofErr w:type="spellStart"/>
+      <w:r>
+        <w:t>được</w:t>
+      </w:r>
+      <w:proofErr w:type="spellEnd"/>
+      <w:r>
+        <w:t xml:space="preserve"> set up </w:t>
+      </w:r>
+      <w:proofErr w:type="spellStart"/>
+      <w:r>
+        <w:t>trong</w:t>
+      </w:r>
+      <w:proofErr w:type="spellEnd"/>
+      <w:r>
+        <w:t xml:space="preserve"> </w:t>
+      </w:r>
+      <w:proofErr w:type="spellStart"/>
+      <w:r>
+        <w:t>redis</w:t>
+      </w:r>
+      <w:proofErr w:type="spellEnd"/>
+      <w:r>
+        <w:t xml:space="preserve">. </w:t>
+      </w:r>
+      <w:proofErr w:type="spellStart"/>
+      <w:r>
+        <w:t>Nhờ</w:t>
+      </w:r>
+      <w:proofErr w:type="spellEnd"/>
+      <w:r>
+        <w:t xml:space="preserve"> </w:t>
+      </w:r>
+      <w:proofErr w:type="spellStart"/>
+      <w:r>
+        <w:t>khả</w:t>
+      </w:r>
+      <w:proofErr w:type="spellEnd"/>
+      <w:r>
+        <w:t xml:space="preserve"> </w:t>
+      </w:r>
+      <w:proofErr w:type="spellStart"/>
+      <w:r>
+        <w:t>năng</w:t>
+      </w:r>
+      <w:proofErr w:type="spellEnd"/>
+      <w:r>
+        <w:t xml:space="preserve"> </w:t>
+      </w:r>
+      <w:proofErr w:type="spellStart"/>
+      <w:r>
+        <w:t>phân</w:t>
+      </w:r>
+      <w:proofErr w:type="spellEnd"/>
+      <w:r>
+        <w:t xml:space="preserve"> </w:t>
+      </w:r>
+      <w:proofErr w:type="spellStart"/>
+      <w:r>
+        <w:t>vùng</w:t>
+      </w:r>
+      <w:proofErr w:type="spellEnd"/>
+      <w:r>
+        <w:t xml:space="preserve"> spatial </w:t>
+      </w:r>
+      <w:proofErr w:type="spellStart"/>
+      <w:r>
+        <w:t>của</w:t>
+      </w:r>
+      <w:proofErr w:type="spellEnd"/>
+      <w:r>
+        <w:t xml:space="preserve"> </w:t>
+      </w:r>
+      <w:proofErr w:type="spellStart"/>
+      <w:r>
+        <w:t>redis</w:t>
+      </w:r>
+      <w:proofErr w:type="spellEnd"/>
+      <w:r>
+        <w:t xml:space="preserve"> </w:t>
+      </w:r>
+      <w:proofErr w:type="spellStart"/>
+      <w:r>
+        <w:t>và</w:t>
+      </w:r>
+      <w:proofErr w:type="spellEnd"/>
+      <w:r>
+        <w:t xml:space="preserve"> </w:t>
+      </w:r>
+      <w:proofErr w:type="spellStart"/>
+      <w:r>
+        <w:t>các</w:t>
+      </w:r>
+      <w:proofErr w:type="spellEnd"/>
+      <w:r>
+        <w:t xml:space="preserve"> </w:t>
+      </w:r>
+      <w:proofErr w:type="spellStart"/>
+      <w:r>
+        <w:t>điểm</w:t>
+      </w:r>
+      <w:proofErr w:type="spellEnd"/>
+      <w:r>
+        <w:t xml:space="preserve"> </w:t>
+      </w:r>
+      <w:proofErr w:type="spellStart"/>
+      <w:r>
+        <w:t>lưu</w:t>
+      </w:r>
+      <w:proofErr w:type="spellEnd"/>
+      <w:r>
+        <w:t xml:space="preserve"> </w:t>
+      </w:r>
+      <w:proofErr w:type="spellStart"/>
+      <w:r>
+        <w:t>trữ</w:t>
+      </w:r>
+      <w:proofErr w:type="spellEnd"/>
+      <w:r>
+        <w:t xml:space="preserve"> </w:t>
+      </w:r>
+      <w:proofErr w:type="spellStart"/>
+      <w:r>
+        <w:t>sẽ</w:t>
+      </w:r>
+      <w:proofErr w:type="spellEnd"/>
+      <w:r>
+        <w:t xml:space="preserve"> </w:t>
+      </w:r>
+      <w:proofErr w:type="spellStart"/>
+      <w:r>
+        <w:t>được</w:t>
+      </w:r>
+      <w:proofErr w:type="spellEnd"/>
+      <w:r>
+        <w:t xml:space="preserve"> </w:t>
+      </w:r>
+      <w:proofErr w:type="spellStart"/>
+      <w:r>
+        <w:t>mã</w:t>
+      </w:r>
+      <w:proofErr w:type="spellEnd"/>
+      <w:r>
+        <w:t xml:space="preserve"> </w:t>
+      </w:r>
+      <w:proofErr w:type="spellStart"/>
+      <w:r>
+        <w:t>hóa</w:t>
+      </w:r>
+      <w:proofErr w:type="spellEnd"/>
+      <w:r>
+        <w:t xml:space="preserve"> </w:t>
+      </w:r>
+      <w:proofErr w:type="spellStart"/>
+      <w:r>
+        <w:t>thành</w:t>
+      </w:r>
+      <w:proofErr w:type="spellEnd"/>
+      <w:r>
+        <w:t xml:space="preserve"> </w:t>
+      </w:r>
+      <w:proofErr w:type="spellStart"/>
+      <w:r>
+        <w:t>GeoHash</w:t>
+      </w:r>
+      <w:proofErr w:type="spellEnd"/>
+      <w:r>
+        <w:t xml:space="preserve">, </w:t>
+      </w:r>
+      <w:proofErr w:type="spellStart"/>
+      <w:r>
+        <w:t>được</w:t>
+      </w:r>
+      <w:proofErr w:type="spellEnd"/>
+      <w:r>
+        <w:t xml:space="preserve"> </w:t>
+      </w:r>
+      <w:proofErr w:type="spellStart"/>
+      <w:r>
+        <w:t>lưu</w:t>
+      </w:r>
+      <w:proofErr w:type="spellEnd"/>
+      <w:r>
+        <w:t xml:space="preserve"> </w:t>
+      </w:r>
+      <w:proofErr w:type="spellStart"/>
+      <w:r>
+        <w:t>dưới</w:t>
+      </w:r>
+      <w:proofErr w:type="spellEnd"/>
+      <w:r>
+        <w:t xml:space="preserve"> </w:t>
+      </w:r>
+      <w:proofErr w:type="spellStart"/>
+      <w:r>
+        <w:t>dạng</w:t>
+      </w:r>
+      <w:proofErr w:type="spellEnd"/>
+      <w:r>
+        <w:t xml:space="preserve"> </w:t>
+      </w:r>
+      <w:proofErr w:type="spellStart"/>
+      <w:r>
+        <w:t>sortedSet</w:t>
+      </w:r>
+      <w:proofErr w:type="spellEnd"/>
+    </w:p>
+    <w:p>
+      <w:r>
+        <w:t>=</w:t>
+      </w:r>
+      <w:proofErr w:type="gramStart"/>
+      <w:r>
+        <w:t xml:space="preserve">&gt;  </w:t>
+      </w:r>
+      <w:proofErr w:type="spellStart"/>
+      <w:r>
+        <w:t>chúng</w:t>
+      </w:r>
+      <w:proofErr w:type="spellEnd"/>
+      <w:proofErr w:type="gramEnd"/>
+      <w:r>
+        <w:t xml:space="preserve"> ta </w:t>
+      </w:r>
+      <w:proofErr w:type="spellStart"/>
+      <w:r>
+        <w:t>sẽ</w:t>
+      </w:r>
+      <w:proofErr w:type="spellEnd"/>
+      <w:r>
+        <w:t xml:space="preserve"> </w:t>
+      </w:r>
+      <w:proofErr w:type="spellStart"/>
+      <w:r>
+        <w:t>có</w:t>
+      </w:r>
+      <w:proofErr w:type="spellEnd"/>
+      <w:r>
+        <w:t xml:space="preserve"> 3 method</w:t>
+      </w:r>
+    </w:p>
+    <w:p>
+      <w:r>
+        <w:t xml:space="preserve">Method updated </w:t>
+      </w:r>
+      <w:proofErr w:type="spellStart"/>
+      <w:r>
+        <w:t>vị</w:t>
+      </w:r>
+      <w:proofErr w:type="spellEnd"/>
+      <w:r>
+        <w:t xml:space="preserve"> </w:t>
+      </w:r>
+      <w:proofErr w:type="spellStart"/>
+      <w:r>
+        <w:t>trí</w:t>
+      </w:r>
+      <w:proofErr w:type="spellEnd"/>
+      <w:r>
+        <w:t xml:space="preserve"> </w:t>
+      </w:r>
+      <w:proofErr w:type="spellStart"/>
+      <w:r>
+        <w:t>của</w:t>
+      </w:r>
+      <w:proofErr w:type="spellEnd"/>
+      <w:r>
+        <w:t xml:space="preserve"> </w:t>
+      </w:r>
+      <w:proofErr w:type="spellStart"/>
+      <w:r>
+        <w:t>tài</w:t>
+      </w:r>
+      <w:proofErr w:type="spellEnd"/>
+      <w:r>
+        <w:t xml:space="preserve"> </w:t>
+      </w:r>
+      <w:proofErr w:type="spellStart"/>
+      <w:r>
+        <w:t>xế</w:t>
+      </w:r>
+      <w:proofErr w:type="spellEnd"/>
+      <w:r>
+        <w:t xml:space="preserve"> =&gt; </w:t>
+      </w:r>
+      <w:proofErr w:type="spellStart"/>
+      <w:r>
+        <w:t>dùng</w:t>
+      </w:r>
+      <w:proofErr w:type="spellEnd"/>
+      <w:r>
+        <w:t xml:space="preserve"> point </w:t>
+      </w:r>
+      <w:proofErr w:type="spellStart"/>
+      <w:r>
+        <w:t>của</w:t>
+      </w:r>
+      <w:proofErr w:type="spellEnd"/>
+      <w:r>
+        <w:t xml:space="preserve"> Java =&gt; spring </w:t>
+      </w:r>
+      <w:proofErr w:type="spellStart"/>
+      <w:r>
+        <w:t>data.geo</w:t>
+      </w:r>
+      <w:proofErr w:type="spellEnd"/>
+      <w:r>
+        <w:t xml:space="preserve"> </w:t>
+      </w:r>
+      <w:proofErr w:type="spellStart"/>
+      <w:r>
+        <w:t>để</w:t>
+      </w:r>
+      <w:proofErr w:type="spellEnd"/>
+      <w:r>
+        <w:t xml:space="preserve"> </w:t>
+      </w:r>
+      <w:proofErr w:type="spellStart"/>
+      <w:r>
+        <w:t>tạo</w:t>
+      </w:r>
+      <w:proofErr w:type="spellEnd"/>
+      <w:r>
+        <w:t xml:space="preserve"> point </w:t>
+      </w:r>
+      <w:proofErr w:type="spellStart"/>
+      <w:r>
+        <w:t>sau</w:t>
+      </w:r>
+      <w:proofErr w:type="spellEnd"/>
+      <w:r>
+        <w:t xml:space="preserve"> </w:t>
+      </w:r>
+      <w:proofErr w:type="spellStart"/>
+      <w:r>
+        <w:t>đó</w:t>
+      </w:r>
+      <w:proofErr w:type="spellEnd"/>
+      <w:r>
+        <w:t xml:space="preserve"> updated/save </w:t>
+      </w:r>
+      <w:proofErr w:type="spellStart"/>
+      <w:r>
+        <w:t>vị</w:t>
+      </w:r>
+      <w:proofErr w:type="spellEnd"/>
+      <w:r>
+        <w:t xml:space="preserve"> </w:t>
+      </w:r>
+      <w:proofErr w:type="spellStart"/>
+      <w:r>
+        <w:t>trí</w:t>
+      </w:r>
+      <w:proofErr w:type="spellEnd"/>
+      <w:r>
+        <w:t xml:space="preserve"> </w:t>
+      </w:r>
+      <w:proofErr w:type="spellStart"/>
+      <w:r>
+        <w:t>này</w:t>
+      </w:r>
+      <w:proofErr w:type="spellEnd"/>
+      <w:r>
+        <w:t xml:space="preserve"> </w:t>
+      </w:r>
+      <w:proofErr w:type="spellStart"/>
+      <w:r>
+        <w:t>trong</w:t>
+      </w:r>
+      <w:proofErr w:type="spellEnd"/>
+      <w:r>
+        <w:t xml:space="preserve"> </w:t>
+      </w:r>
+      <w:proofErr w:type="spellStart"/>
+      <w:r>
+        <w:t>redis</w:t>
+      </w:r>
+      <w:proofErr w:type="spellEnd"/>
+      <w:r>
+        <w:t>(geo add)</w:t>
+      </w:r>
+    </w:p>
+    <w:p>
+      <w:proofErr w:type="spellStart"/>
+      <w:r>
+        <w:t>Thứ</w:t>
+      </w:r>
+      <w:proofErr w:type="spellEnd"/>
+      <w:r>
+        <w:t xml:space="preserve"> 2 </w:t>
+      </w:r>
+      <w:proofErr w:type="spellStart"/>
+      <w:r>
+        <w:t>khi</w:t>
+      </w:r>
+      <w:proofErr w:type="spellEnd"/>
+      <w:r>
+        <w:t xml:space="preserve"> </w:t>
+      </w:r>
+      <w:proofErr w:type="spellStart"/>
+      <w:r>
+        <w:t>có</w:t>
+      </w:r>
+      <w:proofErr w:type="spellEnd"/>
+      <w:r>
+        <w:t xml:space="preserve"> </w:t>
+      </w:r>
+      <w:proofErr w:type="spellStart"/>
+      <w:r>
+        <w:t>vị</w:t>
+      </w:r>
+      <w:proofErr w:type="spellEnd"/>
+      <w:r>
+        <w:t xml:space="preserve"> </w:t>
+      </w:r>
+      <w:proofErr w:type="spellStart"/>
+      <w:r>
+        <w:t>trí</w:t>
+      </w:r>
+      <w:proofErr w:type="spellEnd"/>
+      <w:r>
+        <w:t xml:space="preserve"> </w:t>
+      </w:r>
+      <w:proofErr w:type="spellStart"/>
+      <w:r>
+        <w:t>được</w:t>
+      </w:r>
+      <w:proofErr w:type="spellEnd"/>
+      <w:r>
+        <w:t xml:space="preserve"> </w:t>
+      </w:r>
+      <w:proofErr w:type="spellStart"/>
+      <w:r>
+        <w:t>lưu</w:t>
+      </w:r>
+      <w:proofErr w:type="spellEnd"/>
+      <w:r>
+        <w:t xml:space="preserve"> </w:t>
+      </w:r>
+      <w:proofErr w:type="spellStart"/>
+      <w:r>
+        <w:t>rồi</w:t>
+      </w:r>
+      <w:proofErr w:type="spellEnd"/>
+      <w:r>
+        <w:t xml:space="preserve"> </w:t>
+      </w:r>
+      <w:proofErr w:type="spellStart"/>
+      <w:r>
+        <w:t>thì</w:t>
+      </w:r>
+      <w:proofErr w:type="spellEnd"/>
+      <w:r>
+        <w:t xml:space="preserve"> </w:t>
+      </w:r>
+      <w:proofErr w:type="spellStart"/>
+      <w:r>
+        <w:t>sẽ</w:t>
+      </w:r>
+      <w:proofErr w:type="spellEnd"/>
+      <w:r>
+        <w:t xml:space="preserve"> </w:t>
+      </w:r>
+      <w:proofErr w:type="spellStart"/>
+      <w:r>
+        <w:t>tìm</w:t>
+      </w:r>
+      <w:proofErr w:type="spellEnd"/>
+      <w:r>
+        <w:t xml:space="preserve"> </w:t>
+      </w:r>
+      <w:proofErr w:type="spellStart"/>
+      <w:r>
+        <w:t>luôn</w:t>
+      </w:r>
+      <w:proofErr w:type="spellEnd"/>
+      <w:r>
+        <w:t xml:space="preserve"> </w:t>
+      </w:r>
+      <w:proofErr w:type="spellStart"/>
+      <w:r>
+        <w:t>vị</w:t>
+      </w:r>
+      <w:proofErr w:type="spellEnd"/>
+      <w:r>
+        <w:t xml:space="preserve"> </w:t>
+      </w:r>
+      <w:proofErr w:type="spellStart"/>
+      <w:r>
+        <w:t>trí</w:t>
+      </w:r>
+      <w:proofErr w:type="spellEnd"/>
+      <w:r>
+        <w:t xml:space="preserve"> </w:t>
+      </w:r>
+      <w:proofErr w:type="spellStart"/>
+      <w:r>
+        <w:t>của</w:t>
+      </w:r>
+      <w:proofErr w:type="spellEnd"/>
+      <w:r>
+        <w:t xml:space="preserve"> </w:t>
+      </w:r>
+      <w:proofErr w:type="spellStart"/>
+      <w:r>
+        <w:t>tài</w:t>
+      </w:r>
+      <w:proofErr w:type="spellEnd"/>
+      <w:r>
+        <w:t xml:space="preserve"> </w:t>
+      </w:r>
+      <w:proofErr w:type="spellStart"/>
+      <w:r>
+        <w:t>xế</w:t>
+      </w:r>
+      <w:proofErr w:type="spellEnd"/>
+      <w:r>
+        <w:t xml:space="preserve"> ở </w:t>
+      </w:r>
+      <w:proofErr w:type="spellStart"/>
+      <w:r>
+        <w:t>đây</w:t>
+      </w:r>
+      <w:proofErr w:type="spellEnd"/>
+      <w:r>
+        <w:t xml:space="preserve"> </w:t>
+      </w:r>
+      <w:proofErr w:type="spellStart"/>
+      <w:r>
+        <w:t>thông</w:t>
+      </w:r>
+      <w:proofErr w:type="spellEnd"/>
+      <w:r>
+        <w:t xml:space="preserve"> =&gt; </w:t>
+      </w:r>
+      <w:proofErr w:type="spellStart"/>
+      <w:r>
+        <w:t>thông</w:t>
+      </w:r>
+      <w:proofErr w:type="spellEnd"/>
+      <w:r>
+        <w:t xml:space="preserve"> qua geo search, </w:t>
+      </w:r>
+      <w:proofErr w:type="spellStart"/>
+      <w:r>
+        <w:t>sẽ</w:t>
+      </w:r>
+      <w:proofErr w:type="spellEnd"/>
+      <w:r>
+        <w:t xml:space="preserve"> </w:t>
+      </w:r>
+      <w:proofErr w:type="spellStart"/>
+      <w:r>
+        <w:t>lấy</w:t>
+      </w:r>
+      <w:proofErr w:type="spellEnd"/>
+      <w:r>
+        <w:t xml:space="preserve"> </w:t>
+      </w:r>
+      <w:proofErr w:type="spellStart"/>
+      <w:r>
+        <w:t>tọa</w:t>
+      </w:r>
+      <w:proofErr w:type="spellEnd"/>
+      <w:r>
+        <w:t xml:space="preserve"> </w:t>
+      </w:r>
+      <w:proofErr w:type="spellStart"/>
+      <w:r>
+        <w:t>độ</w:t>
+      </w:r>
+      <w:proofErr w:type="spellEnd"/>
+      <w:r>
+        <w:t xml:space="preserve"> </w:t>
+      </w:r>
+      <w:proofErr w:type="spellStart"/>
+      <w:r>
+        <w:t>của</w:t>
+      </w:r>
+      <w:proofErr w:type="spellEnd"/>
+      <w:r>
+        <w:t xml:space="preserve"> </w:t>
+      </w:r>
+      <w:proofErr w:type="spellStart"/>
+      <w:r>
+        <w:t>khách</w:t>
+      </w:r>
+      <w:proofErr w:type="spellEnd"/>
+      <w:r>
+        <w:t xml:space="preserve"> </w:t>
+      </w:r>
+      <w:proofErr w:type="spellStart"/>
+      <w:r>
+        <w:t>cùng</w:t>
+      </w:r>
+      <w:proofErr w:type="spellEnd"/>
+      <w:r>
+        <w:t xml:space="preserve"> </w:t>
+      </w:r>
+      <w:proofErr w:type="spellStart"/>
+      <w:r>
+        <w:t>bán</w:t>
+      </w:r>
+      <w:proofErr w:type="spellEnd"/>
+      <w:r>
+        <w:t xml:space="preserve"> </w:t>
+      </w:r>
+      <w:proofErr w:type="spellStart"/>
+      <w:r>
+        <w:t>kính</w:t>
+      </w:r>
+      <w:proofErr w:type="spellEnd"/>
+      <w:r>
+        <w:t xml:space="preserve"> </w:t>
+      </w:r>
+      <w:proofErr w:type="spellStart"/>
+      <w:r>
+        <w:t>khách</w:t>
+      </w:r>
+      <w:proofErr w:type="spellEnd"/>
+      <w:r>
+        <w:t xml:space="preserve"> hang </w:t>
+      </w:r>
+      <w:proofErr w:type="spellStart"/>
+      <w:r>
+        <w:t>mong</w:t>
+      </w:r>
+      <w:proofErr w:type="spellEnd"/>
+      <w:r>
+        <w:t xml:space="preserve"> </w:t>
+      </w:r>
+      <w:proofErr w:type="spellStart"/>
+      <w:r>
+        <w:t>muốn</w:t>
+      </w:r>
+      <w:proofErr w:type="spellEnd"/>
+      <w:r>
+        <w:t xml:space="preserve"> </w:t>
+      </w:r>
+      <w:proofErr w:type="spellStart"/>
+      <w:r>
+        <w:t>tìm</w:t>
+      </w:r>
+      <w:proofErr w:type="spellEnd"/>
+      <w:r>
+        <w:t xml:space="preserve"> </w:t>
+      </w:r>
+      <w:proofErr w:type="spellStart"/>
+      <w:r>
+        <w:t>tài</w:t>
+      </w:r>
+      <w:proofErr w:type="spellEnd"/>
+      <w:r>
+        <w:t xml:space="preserve"> </w:t>
+      </w:r>
+      <w:proofErr w:type="spellStart"/>
+      <w:r>
+        <w:t>xế</w:t>
+      </w:r>
+      <w:proofErr w:type="spellEnd"/>
+      <w:r>
+        <w:t xml:space="preserve"> =&gt; </w:t>
+      </w:r>
+      <w:proofErr w:type="spellStart"/>
+      <w:r>
+        <w:t>sau</w:t>
+      </w:r>
+      <w:proofErr w:type="spellEnd"/>
+      <w:r>
+        <w:t xml:space="preserve"> </w:t>
+      </w:r>
+      <w:proofErr w:type="spellStart"/>
+      <w:r>
+        <w:t>đó</w:t>
+      </w:r>
+      <w:proofErr w:type="spellEnd"/>
+      <w:r>
+        <w:t xml:space="preserve"> </w:t>
+      </w:r>
+      <w:proofErr w:type="spellStart"/>
+      <w:r>
+        <w:t>sẽ</w:t>
+      </w:r>
+      <w:proofErr w:type="spellEnd"/>
+      <w:r>
+        <w:t xml:space="preserve"> </w:t>
+      </w:r>
+      <w:proofErr w:type="spellStart"/>
+      <w:r>
+        <w:t>tìm</w:t>
+      </w:r>
+      <w:proofErr w:type="spellEnd"/>
+      <w:r>
+        <w:t xml:space="preserve"> </w:t>
+      </w:r>
+      <w:proofErr w:type="spellStart"/>
+      <w:r>
+        <w:t>tài</w:t>
+      </w:r>
+      <w:proofErr w:type="spellEnd"/>
+      <w:r>
+        <w:t xml:space="preserve"> </w:t>
+      </w:r>
+      <w:proofErr w:type="spellStart"/>
+      <w:r>
+        <w:t>xế</w:t>
+      </w:r>
+      <w:proofErr w:type="spellEnd"/>
+      <w:r>
+        <w:t xml:space="preserve"> </w:t>
+      </w:r>
+      <w:proofErr w:type="spellStart"/>
+      <w:r>
+        <w:t>gần</w:t>
+      </w:r>
+      <w:proofErr w:type="spellEnd"/>
+      <w:r>
+        <w:t xml:space="preserve"> </w:t>
+      </w:r>
+      <w:proofErr w:type="spellStart"/>
+      <w:r>
+        <w:t>nhất</w:t>
+      </w:r>
+      <w:proofErr w:type="spellEnd"/>
+    </w:p>
+    <w:p>
+      <w:proofErr w:type="spellStart"/>
+      <w:r>
+        <w:t>Thứ</w:t>
+      </w:r>
+      <w:proofErr w:type="spellEnd"/>
+      <w:r>
+        <w:t xml:space="preserve"> 3 </w:t>
+      </w:r>
+      <w:proofErr w:type="spellStart"/>
+      <w:r>
+        <w:t>khi</w:t>
+      </w:r>
+      <w:proofErr w:type="spellEnd"/>
+      <w:r>
+        <w:t xml:space="preserve"> </w:t>
+      </w:r>
+      <w:proofErr w:type="gramStart"/>
+      <w:r>
+        <w:t>1</w:t>
+      </w:r>
+      <w:proofErr w:type="gramEnd"/>
+      <w:r>
+        <w:t xml:space="preserve"> </w:t>
+      </w:r>
+      <w:proofErr w:type="spellStart"/>
+      <w:r>
+        <w:t>trạng</w:t>
+      </w:r>
+      <w:proofErr w:type="spellEnd"/>
+      <w:r>
+        <w:t xml:space="preserve"> </w:t>
+      </w:r>
+      <w:proofErr w:type="spellStart"/>
+      <w:r>
+        <w:t>thái</w:t>
+      </w:r>
+      <w:proofErr w:type="spellEnd"/>
+      <w:r>
+        <w:t xml:space="preserve"> </w:t>
+      </w:r>
+      <w:proofErr w:type="spellStart"/>
+      <w:r>
+        <w:t>của</w:t>
+      </w:r>
+      <w:proofErr w:type="spellEnd"/>
+      <w:r>
+        <w:t xml:space="preserve"> </w:t>
+      </w:r>
+      <w:proofErr w:type="spellStart"/>
+      <w:r>
+        <w:t>tài</w:t>
+      </w:r>
+      <w:proofErr w:type="spellEnd"/>
+      <w:r>
+        <w:t xml:space="preserve"> </w:t>
+      </w:r>
+      <w:proofErr w:type="spellStart"/>
+      <w:r>
+        <w:t>xế</w:t>
+      </w:r>
+      <w:proofErr w:type="spellEnd"/>
+      <w:r>
+        <w:t xml:space="preserve"> ở </w:t>
+      </w:r>
+      <w:proofErr w:type="spellStart"/>
+      <w:r>
+        <w:t>trọng</w:t>
+      </w:r>
+      <w:proofErr w:type="spellEnd"/>
+      <w:r>
+        <w:t xml:space="preserve"> </w:t>
+      </w:r>
+      <w:proofErr w:type="spellStart"/>
+      <w:r>
+        <w:t>thái</w:t>
+      </w:r>
+      <w:proofErr w:type="spellEnd"/>
+      <w:r>
+        <w:t xml:space="preserve"> offline </w:t>
+      </w:r>
+      <w:proofErr w:type="spellStart"/>
+      <w:r>
+        <w:t>thì</w:t>
+      </w:r>
+      <w:proofErr w:type="spellEnd"/>
+      <w:r>
+        <w:t xml:space="preserve"> </w:t>
+      </w:r>
+      <w:proofErr w:type="spellStart"/>
+      <w:r>
+        <w:t>nên</w:t>
+      </w:r>
+      <w:proofErr w:type="spellEnd"/>
+      <w:r>
+        <w:t xml:space="preserve"> </w:t>
+      </w:r>
+      <w:proofErr w:type="spellStart"/>
+      <w:r>
+        <w:t>xóa</w:t>
+      </w:r>
+      <w:proofErr w:type="spellEnd"/>
+      <w:r>
+        <w:t xml:space="preserve"> </w:t>
+      </w:r>
+      <w:proofErr w:type="spellStart"/>
+      <w:r>
+        <w:t>tài</w:t>
+      </w:r>
+      <w:proofErr w:type="spellEnd"/>
+      <w:r>
+        <w:t xml:space="preserve"> </w:t>
+      </w:r>
+      <w:proofErr w:type="spellStart"/>
+      <w:r>
+        <w:t>xế</w:t>
+      </w:r>
+      <w:proofErr w:type="spellEnd"/>
+      <w:r>
+        <w:t xml:space="preserve"> </w:t>
+      </w:r>
+      <w:proofErr w:type="spellStart"/>
+      <w:r>
+        <w:t>đó</w:t>
+      </w:r>
+      <w:proofErr w:type="spellEnd"/>
+      <w:r>
+        <w:t xml:space="preserve"> </w:t>
+      </w:r>
+      <w:proofErr w:type="spellStart"/>
+      <w:r>
+        <w:t>khỏi</w:t>
+      </w:r>
+      <w:proofErr w:type="spellEnd"/>
+      <w:r>
+        <w:t xml:space="preserve"> </w:t>
+      </w:r>
+      <w:proofErr w:type="spellStart"/>
+      <w:r>
+        <w:t>redis</w:t>
+      </w:r>
+      <w:proofErr w:type="spellEnd"/>
+      <w:r>
+        <w:t xml:space="preserve"> =&gt; redis.remove</w:t>
+      </w:r>
+      <w:bookmarkStart w:id="0" w:name="_GoBack"/>
+      <w:bookmarkEnd w:id="0"/>
     </w:p>
     <w:p/>
     <w:sectPr>
@@ -1354,6 +3066,17 @@
       <w:bCs/>
     </w:rPr>
   </w:style>
+  <w:style w:type="paragraph" w:styleId="ListParagraph">
+    <w:name w:val="List Paragraph"/>
+    <w:basedOn w:val="Normal"/>
+    <w:uiPriority w:val="34"/>
+    <w:qFormat/>
+    <w:rsid w:val="008945CE"/>
+    <w:pPr>
+      <w:ind w:left="720"/>
+      <w:contextualSpacing/>
+    </w:pPr>
+  </w:style>
 </w:styles>
 </file>
 

</xml_diff>